<commit_message>
feat: ajustar CV en ingles a 2 paginas exactas e incorporar carrusel infinito de tecnologias
</commit_message>
<xml_diff>
--- a/public/docs/Carlos_Juarez_CV_EN.docx
+++ b/public/docs/Carlos_Juarez_CV_EN.docx
@@ -89,7 +89,7 @@
           <w:szCs w:val="20"/>
           <w:lang w:val="es-ES" w:eastAsia="es-ES"/>
         </w:rPr>
-        <w:t>Full Stack Developer &amp; GenAI, specialized in developing intelligent applications and AI agents, integrating AI and modern toolsets like Claude, Codex, and Antigravity, built on Spec-Driven standards. Results-oriented profile with strong technical vision and focused on delivering tangible business value.</w:t>
+        <w:t>Full Stack Developer &amp; GenAI, specialized in developing intelligent applications and AI agents, integrating AI toolsets (Claude, Codex, Antigravity) under Spec-Driven standards. Results-oriented profile with strong technical vision, delivering tangible business value.</w:t>
       </w:r>
     </w:p>
     <w:p>
@@ -189,7 +189,7 @@
           <w:szCs w:val="20"/>
           <w:lang w:val="es-ES"/>
         </w:rPr>
-        <w:t>Managing end-to-end application lifecycles and internal solutions, from business requirement analysis to architecture design, development, integration, and production deployment, incorporating generative AI to automate processes and optimize workflows.</w:t>
+        <w:t>End-to-end management of application lifecycles and internal solutions, from business requirement analysis to architecture, development, integration, and production deployment, embedding generative AI to automate processes.</w:t>
       </w:r>
     </w:p>
     <w:p>
@@ -213,7 +213,7 @@
           <w:szCs w:val="20"/>
           <w:lang w:val="es-ES"/>
         </w:rPr>
-        <w:t>Development of AI agents integrated with enterprise applications, APIs, databases, and internal workflows via Model Context Protocol (MCP).</w:t>
+        <w:t>Development of AI agents integrated with enterprise apps, APIs, databases, and internal workflows via MCP.</w:t>
       </w:r>
     </w:p>
     <w:p>
@@ -418,7 +418,7 @@
           <w:sz w:val="20"/>
           <w:szCs w:val="20"/>
         </w:rPr>
-        <w:t>Web engineering with PHP, TypeScript, Node.js, Python, and React, integrating databases, REST APIs, and third-party services.</w:t>
+        <w:t>Web engineering with PHP, TypeScript, Node.js, Python, and React, integrating databases, APIs, and cloud services.</w:t>
       </w:r>
     </w:p>
     <w:p>
@@ -440,7 +440,7 @@
           <w:sz w:val="20"/>
           <w:szCs w:val="20"/>
         </w:rPr>
-        <w:t>Platform administration and custom engineering in WordPress, Shopify, and PrestaShop, including custom integrations.</w:t>
+        <w:t>Platform administration and custom engineering across WordPress, Shopify, and PrestaShop.</w:t>
       </w:r>
     </w:p>
     <w:p>
@@ -462,7 +462,7 @@
           <w:sz w:val="20"/>
           <w:szCs w:val="20"/>
         </w:rPr>
-        <w:t>Technical optimization and SEO, contributing to a 15% increase in organic search traffic.</w:t>
+        <w:t>Technical optimization and SEO, achieving a 15% increase in organic search traffic.</w:t>
       </w:r>
     </w:p>
     <w:p>
@@ -537,7 +537,7 @@
           <w:sz w:val="20"/>
           <w:szCs w:val="20"/>
         </w:rPr>
-        <w:t>Technical direction and development of web projects and applications from initial scoping to production deployment.</w:t>
+        <w:t>Technical direction and development of web projects and applications from initial scoping to deployment.</w:t>
       </w:r>
     </w:p>
     <w:p>
@@ -559,7 +559,7 @@
           <w:sz w:val="20"/>
           <w:szCs w:val="20"/>
         </w:rPr>
-        <w:t>Database design and integration, custom APIs, and third-party services tailored to specific client requirements.</w:t>
+        <w:t>Database design and integration, custom APIs, and third-party services tailored to client specifications.</w:t>
       </w:r>
     </w:p>
     <w:p>
@@ -581,7 +581,7 @@
           <w:sz w:val="20"/>
           <w:szCs w:val="20"/>
         </w:rPr>
-        <w:t>Full-lifecycle project management with PHP/Laravel, JavaScript, and React for national and international clients.</w:t>
+        <w:t>Full project management with PHP/Laravel, JavaScript, and React for national and international clients.</w:t>
       </w:r>
     </w:p>
     <w:p>
@@ -638,7 +638,7 @@
           <w:sz w:val="20"/>
           <w:szCs w:val="20"/>
         </w:rPr>
-        <w:t>Founding and management of a digital development agency and e-commerce ventures.</w:t>
+        <w:t>Founding and operations of a digital development agency and e-commerce ventures.</w:t>
       </w:r>
     </w:p>
     <w:p>
@@ -681,7 +681,7 @@
           <w:sz w:val="20"/>
           <w:szCs w:val="20"/>
         </w:rPr>
-        <w:t>Project management across corporate IT infrastructure; leadership of systems administration and technical support teams.</w:t>
+        <w:t>Project management in corporate IT infrastructure; leadership of systems administration and support teams.</w:t>
       </w:r>
     </w:p>
     <w:p>
@@ -792,6 +792,7 @@
     </w:p>
     <w:p>
       <w:pPr>
+        <w:pageBreakBefore/>
         <w:jc w:val="both"/>
         <w:rPr>
           <w:rFonts w:asciiTheme="majorHAnsi" w:hAnsiTheme="majorHAnsi" w:cstheme="majorHAnsi"/>
@@ -2068,7 +2069,7 @@
     <w:sectPr>
       <w:footerReference w:type="default" r:id="rId11"/>
       <w:pgSz w:w="12240" w:h="15840"/>
-      <w:pgMar w:top="1440" w:right="1080" w:bottom="1440" w:left="1080" w:header="720" w:footer="720" w:gutter="0"/>
+      <w:pgMar w:top="900" w:right="960" w:bottom="900" w:left="960" w:header="720" w:footer="720" w:gutter="0"/>
       <w:cols w:space="720"/>
       <w:docGrid w:linePitch="360"/>
     </w:sectPr>

</xml_diff>